<commit_message>
adding database model for books & start of routes
</commit_message>
<xml_diff>
--- a/BDV 101 Assignment 1 Report.docx
+++ b/BDV 101 Assignment 1 Report.docx
@@ -1025,21 +1025,7 @@
         <w:rPr>
           <w:rFonts w:eastAsia="Times New Roman" w:cs="Calibri"/>
         </w:rPr>
-        <w:t xml:space="preserve"> Design </w:t>
-      </w:r>
-      <w:proofErr w:type="gramStart"/>
-      <w:r>
-        <w:rPr>
-          <w:rFonts w:eastAsia="Times New Roman" w:cs="Calibri"/>
-        </w:rPr>
-        <w:t>A,B</w:t>
-      </w:r>
-      <w:proofErr w:type="gramEnd"/>
-      <w:r>
-        <w:rPr>
-          <w:rFonts w:eastAsia="Times New Roman" w:cs="Calibri"/>
-        </w:rPr>
-        <w:t>, and C</w:t>
+        <w:t xml:space="preserve"> Design A,B, and C</w:t>
       </w:r>
     </w:p>
     <w:p>
@@ -1552,21 +1538,7 @@
         <w:rPr>
           <w:rFonts w:eastAsia="Arial" w:cs="Arial"/>
         </w:rPr>
-        <w:t xml:space="preserve">Your API should be documented using </w:t>
-      </w:r>
-      <w:proofErr w:type="spellStart"/>
-      <w:r>
-        <w:rPr>
-          <w:rFonts w:eastAsia="Arial" w:cs="Arial"/>
-        </w:rPr>
-        <w:t>OpenAPI</w:t>
-      </w:r>
-      <w:proofErr w:type="spellEnd"/>
-      <w:r>
-        <w:rPr>
-          <w:rFonts w:eastAsia="Arial" w:cs="Arial"/>
-        </w:rPr>
-        <w:t xml:space="preserve"> (formerly Swagger). The documentation should include all available endpoints, parameters, data formats, and authentication requirements (see Module 4). </w:t>
+        <w:t xml:space="preserve">Your API should be documented using OpenAPI (formerly Swagger). The documentation should include all available endpoints, parameters, data formats, and authentication requirements (see Module 4). </w:t>
       </w:r>
     </w:p>
     <w:p>
@@ -1829,11 +1801,276 @@
     </w:p>
     <w:p>
       <w:pPr>
+        <w:rPr>
+          <w:rFonts w:cs="Calibri"/>
+          <w:lang w:val="en-US"/>
+        </w:rPr>
+      </w:pPr>
+    </w:p>
+    <w:p>
+      <w:pPr>
+        <w:pStyle w:val="Heading2"/>
+      </w:pPr>
+      <w:r>
+        <w:t>Model/Database schemas</w:t>
+      </w:r>
+    </w:p>
+    <w:p>
+      <w:pPr>
+        <w:rPr>
+          <w:lang w:val="en-US"/>
+        </w:rPr>
+      </w:pPr>
+      <w:r>
+        <w:rPr>
+          <w:lang w:val="en-US"/>
+        </w:rPr>
+        <w:t>For this project I started to only start with the requirements and have them all be required and then expanded to further attributes for the database later.</w:t>
+      </w:r>
+    </w:p>
+    <w:p>
+      <w:pPr>
+        <w:pStyle w:val="ListParagraph"/>
+        <w:numPr>
+          <w:ilvl w:val="0"/>
+          <w:numId w:val="10"/>
+        </w:numPr>
         <w:spacing w:line="257" w:lineRule="auto"/>
         <w:rPr>
           <w:rFonts w:cs="Calibri"/>
         </w:rPr>
       </w:pPr>
+      <w:r>
+        <w:rPr>
+          <w:rFonts w:eastAsia="Arial" w:cs="Arial"/>
+        </w:rPr>
+        <w:t xml:space="preserve">For books, all attributes must be passed in because we don’t want to assume anything about the book properties </w:t>
+      </w:r>
+    </w:p>
+    <w:p>
+      <w:pPr>
+        <w:pStyle w:val="ListParagraph"/>
+        <w:numPr>
+          <w:ilvl w:val="1"/>
+          <w:numId w:val="10"/>
+        </w:numPr>
+        <w:spacing w:line="257" w:lineRule="auto"/>
+        <w:rPr>
+          <w:rFonts w:cs="Calibri"/>
+        </w:rPr>
+      </w:pPr>
+      <w:r>
+        <w:rPr>
+          <w:rFonts w:cs="Calibri"/>
+        </w:rPr>
+        <w:t>title: String</w:t>
+      </w:r>
+      <w:r>
+        <w:rPr>
+          <w:rFonts w:cs="Calibri"/>
+        </w:rPr>
+        <w:t>, string type for storing text.</w:t>
+      </w:r>
+    </w:p>
+    <w:p>
+      <w:pPr>
+        <w:pStyle w:val="ListParagraph"/>
+        <w:numPr>
+          <w:ilvl w:val="1"/>
+          <w:numId w:val="10"/>
+        </w:numPr>
+        <w:spacing w:line="257" w:lineRule="auto"/>
+        <w:rPr>
+          <w:rFonts w:cs="Calibri"/>
+        </w:rPr>
+      </w:pPr>
+      <w:r>
+        <w:rPr>
+          <w:rFonts w:cs="Calibri"/>
+        </w:rPr>
+        <w:t>author: String</w:t>
+      </w:r>
+      <w:r>
+        <w:rPr>
+          <w:rFonts w:cs="Calibri"/>
+        </w:rPr>
+        <w:t>, string type for storing text.</w:t>
+      </w:r>
+    </w:p>
+    <w:p>
+      <w:pPr>
+        <w:pStyle w:val="ListParagraph"/>
+        <w:numPr>
+          <w:ilvl w:val="1"/>
+          <w:numId w:val="10"/>
+        </w:numPr>
+        <w:spacing w:line="257" w:lineRule="auto"/>
+        <w:rPr>
+          <w:rFonts w:cs="Calibri"/>
+        </w:rPr>
+      </w:pPr>
+      <w:r>
+        <w:rPr>
+          <w:rFonts w:cs="Calibri"/>
+        </w:rPr>
+        <w:t>publicationDate: Date</w:t>
+      </w:r>
+      <w:r>
+        <w:rPr>
+          <w:rFonts w:cs="Calibri"/>
+        </w:rPr>
+        <w:t>, date type for storing a date.</w:t>
+      </w:r>
+    </w:p>
+    <w:p>
+      <w:pPr>
+        <w:pStyle w:val="ListParagraph"/>
+        <w:numPr>
+          <w:ilvl w:val="1"/>
+          <w:numId w:val="10"/>
+        </w:numPr>
+        <w:spacing w:line="257" w:lineRule="auto"/>
+        <w:rPr>
+          <w:rFonts w:cs="Calibri"/>
+        </w:rPr>
+      </w:pPr>
+      <w:r>
+        <w:rPr>
+          <w:rFonts w:cs="Calibri"/>
+        </w:rPr>
+        <w:t>isbn: Number</w:t>
+      </w:r>
+      <w:r>
+        <w:rPr>
+          <w:rFonts w:cs="Calibri"/>
+        </w:rPr>
+        <w:t xml:space="preserve">, ISBN numbers are 13 digit numbers </w:t>
+      </w:r>
+      <w:r>
+        <w:rPr>
+          <w:rFonts w:cs="Calibri"/>
+        </w:rPr>
+        <w:fldChar w:fldCharType="begin"/>
+      </w:r>
+      <w:r>
+        <w:rPr>
+          <w:rFonts w:cs="Calibri"/>
+        </w:rPr>
+        <w:instrText xml:space="preserve"> ADDIN ZOTERO_ITEM CSL_CITATION {"citationID":"pbPlBDwn","properties":{"unsorted":false,"formattedCitation":"(Canada, 2025)","plainCitation":"(Canada, 2025)","noteIndex":0},"citationItems":[{"id":1046,"uris":["http://zotero.org/users/5175327/items/XMWS87A7"],"itemData":{"id":1046,"type":"webpage","language":"eng","note":"Last Modified: 2026-05-15","title":"International Standard Book Numbers (ISBN)","URL":"https://www.canada.ca/en/library-archives/services/publishers/isbn.html","author":[{"family":"Canada","given":"Library and Archives"}],"accessed":{"date-parts":[["2026",6,29]]},"issued":{"date-parts":[["2025",7,29]]}}}],"schema":"https://github.com/citation-style-language/schema/raw/master/csl-citation.json"} </w:instrText>
+      </w:r>
+      <w:r>
+        <w:rPr>
+          <w:rFonts w:cs="Calibri"/>
+        </w:rPr>
+        <w:fldChar w:fldCharType="separate"/>
+      </w:r>
+      <w:r>
+        <w:rPr>
+          <w:rFonts w:cs="Calibri"/>
+        </w:rPr>
+        <w:t>(Canada, 2025)</w:t>
+      </w:r>
+      <w:r>
+        <w:rPr>
+          <w:rFonts w:cs="Calibri"/>
+        </w:rPr>
+        <w:fldChar w:fldCharType="end"/>
+      </w:r>
+      <w:r>
+        <w:rPr>
+          <w:rFonts w:cs="Calibri"/>
+        </w:rPr>
+        <w:t>.</w:t>
+      </w:r>
+    </w:p>
+    <w:p>
+      <w:pPr>
+        <w:spacing w:line="257" w:lineRule="auto"/>
+        <w:rPr>
+          <w:rFonts w:cs="Calibri"/>
+        </w:rPr>
+      </w:pPr>
+    </w:p>
+    <w:p>
+      <w:pPr>
+        <w:spacing w:line="257" w:lineRule="auto"/>
+        <w:rPr>
+          <w:rFonts w:cs="Calibri"/>
+        </w:rPr>
+      </w:pPr>
+    </w:p>
+    <w:p>
+      <w:pPr>
+        <w:pStyle w:val="ListParagraph"/>
+        <w:numPr>
+          <w:ilvl w:val="0"/>
+          <w:numId w:val="10"/>
+        </w:numPr>
+        <w:spacing w:before="40" w:line="240" w:lineRule="auto"/>
+      </w:pPr>
+      <w:r>
+        <w:rPr>
+          <w:rFonts w:eastAsia="Arial" w:cs="Arial"/>
+        </w:rPr>
+        <w:t xml:space="preserve">For </w:t>
+      </w:r>
+      <w:r>
+        <w:rPr>
+          <w:rFonts w:eastAsia="Arial" w:cs="Arial"/>
+        </w:rPr>
+        <w:t>author</w:t>
+      </w:r>
+      <w:r>
+        <w:rPr>
+          <w:rFonts w:eastAsia="Arial" w:cs="Arial"/>
+        </w:rPr>
+        <w:t>s, again all attributes must be passed (</w:t>
+      </w:r>
+      <w:r>
+        <w:rPr>
+          <w:rFonts w:eastAsia="Arial" w:cs="Arial"/>
+        </w:rPr>
+        <w:t>name, list of books, and a brief biography</w:t>
+      </w:r>
+      <w:r>
+        <w:rPr>
+          <w:rFonts w:eastAsia="Arial" w:cs="Arial"/>
+        </w:rPr>
+        <w:t>).</w:t>
+      </w:r>
+    </w:p>
+    <w:p>
+      <w:pPr>
+        <w:pStyle w:val="ListParagraph"/>
+        <w:numPr>
+          <w:ilvl w:val="0"/>
+          <w:numId w:val="10"/>
+        </w:numPr>
+        <w:spacing w:before="40" w:line="240" w:lineRule="auto"/>
+      </w:pPr>
+      <w:r>
+        <w:rPr>
+          <w:rFonts w:eastAsia="Arial" w:cs="Arial"/>
+        </w:rPr>
+        <w:t>For users, again all attributes are needed (</w:t>
+      </w:r>
+      <w:r>
+        <w:rPr>
+          <w:rFonts w:eastAsia="Arial" w:cs="Arial"/>
+        </w:rPr>
+        <w:t>name, email, and a list of books they've purchased</w:t>
+      </w:r>
+      <w:r>
+        <w:rPr>
+          <w:rFonts w:eastAsia="Arial" w:cs="Arial"/>
+        </w:rPr>
+        <w:t>).</w:t>
+      </w:r>
+    </w:p>
+    <w:p>
+      <w:pPr>
+        <w:spacing w:before="40" w:line="240" w:lineRule="auto"/>
+      </w:pPr>
     </w:p>
     <w:p>
       <w:pPr>
@@ -1938,7 +2175,6 @@
         <w:rPr>
           <w:lang w:val="en-US"/>
         </w:rPr>
-        <w:lastRenderedPageBreak/>
         <w:t>A</w:t>
       </w:r>
       <w:r>
@@ -1992,61 +2228,11 @@
           <w:lang w:val="en-US"/>
         </w:rPr>
       </w:pPr>
-      <w:proofErr w:type="gramStart"/>
       <w:r>
         <w:rPr>
           <w:lang w:val="en-US"/>
         </w:rPr>
-        <w:t>SO</w:t>
-      </w:r>
-      <w:proofErr w:type="gramEnd"/>
-      <w:r>
-        <w:rPr>
-          <w:lang w:val="en-US"/>
-        </w:rPr>
-        <w:t xml:space="preserve"> I decided to just work </w:t>
-      </w:r>
-      <w:proofErr w:type="gramStart"/>
-      <w:r>
-        <w:rPr>
-          <w:lang w:val="en-US"/>
-        </w:rPr>
-        <w:t>off of</w:t>
-      </w:r>
-      <w:proofErr w:type="gramEnd"/>
-      <w:r>
-        <w:rPr>
-          <w:lang w:val="en-US"/>
-        </w:rPr>
-        <w:t xml:space="preserve"> the module reference on building a </w:t>
-      </w:r>
-      <w:proofErr w:type="spellStart"/>
-      <w:r>
-        <w:rPr>
-          <w:lang w:val="en-US"/>
-        </w:rPr>
-        <w:t>restfull</w:t>
-      </w:r>
-      <w:proofErr w:type="spellEnd"/>
-      <w:r>
-        <w:rPr>
-          <w:lang w:val="en-US"/>
-        </w:rPr>
-        <w:t xml:space="preserve"> API with a </w:t>
-      </w:r>
-      <w:proofErr w:type="spellStart"/>
-      <w:r>
-        <w:rPr>
-          <w:lang w:val="en-US"/>
-        </w:rPr>
-        <w:t>mongodb</w:t>
-      </w:r>
-      <w:proofErr w:type="spellEnd"/>
-      <w:r>
-        <w:rPr>
-          <w:lang w:val="en-US"/>
-        </w:rPr>
-        <w:t xml:space="preserve"> database attached: </w:t>
+        <w:t xml:space="preserve">SO I decided to just work off of the module reference on building a restfull API with a mongodb database attached: </w:t>
       </w:r>
       <w:hyperlink r:id="rId11" w:history="1">
         <w:r>
@@ -2125,6 +2311,25 @@
         <w:fldChar w:fldCharType="separate"/>
       </w:r>
       <w:r>
+        <w:t xml:space="preserve">Canada, L. and A. (2025, July 29). </w:t>
+      </w:r>
+      <w:r>
+        <w:rPr>
+          <w:i/>
+          <w:iCs/>
+        </w:rPr>
+        <w:t>International Standard Book Numbers (ISBN)</w:t>
+      </w:r>
+      <w:r>
+        <w:t>. https://www.canada.ca/en/library-archives/services/publishers/isbn.html</w:t>
+      </w:r>
+    </w:p>
+    <w:p>
+      <w:pPr>
+        <w:pStyle w:val="Bibliography"/>
+      </w:pPr>
+      <w:r>
+        <w:lastRenderedPageBreak/>
         <w:t xml:space="preserve">claytonsiemens77. (n.d.). </w:t>
       </w:r>
       <w:r>
@@ -2319,32 +2524,16 @@
         <w:t xml:space="preserve">any technical implementation besides giving tutorials under the “further reading” section which doesn’t make it clear it’s even required. I </w:t>
       </w:r>
       <w:r>
-        <w:t xml:space="preserve">was </w:t>
-      </w:r>
-      <w:proofErr w:type="gramStart"/>
-      <w:r>
-        <w:t>actually</w:t>
-      </w:r>
-      <w:r>
-        <w:t xml:space="preserve"> surprised</w:t>
-      </w:r>
-      <w:proofErr w:type="gramEnd"/>
-      <w:r>
-        <w:t xml:space="preserve"> to see the contents of this assignment because </w:t>
+        <w:t>was actually</w:t>
+      </w:r>
+      <w:r>
+        <w:t xml:space="preserve"> surprised to see the contents of this assignment because </w:t>
       </w:r>
       <w:r>
         <w:t>up to this point all the material and assessments were conceptual</w:t>
       </w:r>
       <w:r>
-        <w:t xml:space="preserve">. I know university is not about learning </w:t>
-      </w:r>
-      <w:proofErr w:type="gramStart"/>
-      <w:r>
-        <w:t>technology</w:t>
-      </w:r>
-      <w:proofErr w:type="gramEnd"/>
-      <w:r>
-        <w:t xml:space="preserve"> but this is a lot to throw at us out of </w:t>
+        <w:t xml:space="preserve">. I know university is not about learning technology but this is a lot to throw at us out of </w:t>
       </w:r>
       <w:r>
         <w:t>nowhere. And seeing as how it’s the only assignment, there is no place for feedback.</w:t>
@@ -2420,6 +2609,118 @@
 <file path=word/numbering.xml><?xml version="1.0" encoding="utf-8"?>
 <w:numbering xmlns:wpc="http://schemas.microsoft.com/office/word/2010/wordprocessingCanvas" xmlns:cx="http://schemas.microsoft.com/office/drawing/2014/chartex" xmlns:cx1="http://schemas.microsoft.com/office/drawing/2015/9/8/chartex" xmlns:cx2="http://schemas.microsoft.com/office/drawing/2015/10/21/chartex" xmlns:cx3="http://schemas.microsoft.com/office/drawing/2016/5/9/chartex" xmlns:cx4="http://schemas.microsoft.com/office/drawing/2016/5/10/chartex" xmlns:cx5="http://schemas.microsoft.com/office/drawing/2016/5/11/chartex" xmlns:cx6="http://schemas.microsoft.com/office/drawing/2016/5/12/chartex" xmlns:cx7="http://schemas.microsoft.com/office/drawing/2016/5/13/chartex" xmlns:cx8="http://schemas.microsoft.com/office/drawing/2016/5/14/chartex" xmlns:mc="http://schemas.openxmlformats.org/markup-compatibility/2006" xmlns:aink="http://schemas.microsoft.com/office/drawing/2016/ink" xmlns:am3d="http://schemas.microsoft.com/office/drawing/2017/model3d" xmlns:o="urn:schemas-microsoft-com:office:office" xmlns:oel="http://schemas.microsoft.com/office/2019/extlst" xmlns:r="http://schemas.openxmlformats.org/officeDocument/2006/relationships" xmlns:m="http://schemas.openxmlformats.org/officeDocument/2006/math" xmlns:v="urn:schemas-microsoft-com:vml" xmlns:wp14="http://schemas.microsoft.com/office/word/2010/wordprocessingDrawing" xmlns:wp="http://schemas.openxmlformats.org/drawingml/2006/wordprocessingDrawing" xmlns:w10="urn:schemas-microsoft-com:office:word" xmlns:w="http://schemas.openxmlformats.org/wordprocessingml/2006/main" xmlns:w14="http://schemas.microsoft.com/office/word/2010/wordml" xmlns:w15="http://schemas.microsoft.com/office/word/2012/wordml" xmlns:w16cex="http://schemas.microsoft.com/office/word/2018/wordml/cex" xmlns:w16cid="http://schemas.microsoft.com/office/word/2016/wordml/cid" xmlns:w16="http://schemas.microsoft.com/office/word/2018/wordml" xmlns:w16du="http://schemas.microsoft.com/office/word/2023/wordml/word16du" xmlns:w16sdtdh="http://schemas.microsoft.com/office/word/2020/wordml/sdtdatahash" xmlns:w16sdtfl="http://schemas.microsoft.com/office/word/2024/wordml/sdtformatlock" xmlns:w16se="http://schemas.microsoft.com/office/word/2015/wordml/symex" xmlns:wpg="http://schemas.microsoft.com/office/word/2010/wordprocessingGroup" xmlns:wpi="http://schemas.microsoft.com/office/word/2010/wordprocessingInk" xmlns:wne="http://schemas.microsoft.com/office/word/2006/wordml" xmlns:wps="http://schemas.microsoft.com/office/word/2010/wordprocessingShape" mc:Ignorable="w14 w15 w16se w16cid w16 w16cex w16sdtdh w16sdtfl w16du wp14">
   <w:abstractNum w:abstractNumId="0" w15:restartNumberingAfterBreak="0">
+    <w:nsid w:val="017F1244"/>
+    <w:multiLevelType w:val="hybridMultilevel"/>
+    <w:tmpl w:val="1DFEE8CC"/>
+    <w:lvl w:ilvl="0" w:tplc="3D400C16">
+      <w:numFmt w:val="bullet"/>
+      <w:lvlText w:val="-"/>
+      <w:lvlJc w:val="left"/>
+      <w:pPr>
+        <w:ind w:left="720" w:hanging="360"/>
+      </w:pPr>
+      <w:rPr>
+        <w:rFonts w:ascii="Calibri" w:eastAsia="Arial" w:hAnsi="Calibri" w:cs="Calibri" w:hint="default"/>
+      </w:rPr>
+    </w:lvl>
+    <w:lvl w:ilvl="1" w:tplc="10090003">
+      <w:start w:val="1"/>
+      <w:numFmt w:val="bullet"/>
+      <w:lvlText w:val="o"/>
+      <w:lvlJc w:val="left"/>
+      <w:pPr>
+        <w:ind w:left="1440" w:hanging="360"/>
+      </w:pPr>
+      <w:rPr>
+        <w:rFonts w:ascii="Courier New" w:hAnsi="Courier New" w:cs="Courier New" w:hint="default"/>
+      </w:rPr>
+    </w:lvl>
+    <w:lvl w:ilvl="2" w:tplc="10090005" w:tentative="1">
+      <w:start w:val="1"/>
+      <w:numFmt w:val="bullet"/>
+      <w:lvlText w:val=""/>
+      <w:lvlJc w:val="left"/>
+      <w:pPr>
+        <w:ind w:left="2160" w:hanging="360"/>
+      </w:pPr>
+      <w:rPr>
+        <w:rFonts w:ascii="Wingdings" w:hAnsi="Wingdings" w:hint="default"/>
+      </w:rPr>
+    </w:lvl>
+    <w:lvl w:ilvl="3" w:tplc="10090001" w:tentative="1">
+      <w:start w:val="1"/>
+      <w:numFmt w:val="bullet"/>
+      <w:lvlText w:val=""/>
+      <w:lvlJc w:val="left"/>
+      <w:pPr>
+        <w:ind w:left="2880" w:hanging="360"/>
+      </w:pPr>
+      <w:rPr>
+        <w:rFonts w:ascii="Symbol" w:hAnsi="Symbol" w:hint="default"/>
+      </w:rPr>
+    </w:lvl>
+    <w:lvl w:ilvl="4" w:tplc="10090003" w:tentative="1">
+      <w:start w:val="1"/>
+      <w:numFmt w:val="bullet"/>
+      <w:lvlText w:val="o"/>
+      <w:lvlJc w:val="left"/>
+      <w:pPr>
+        <w:ind w:left="3600" w:hanging="360"/>
+      </w:pPr>
+      <w:rPr>
+        <w:rFonts w:ascii="Courier New" w:hAnsi="Courier New" w:cs="Courier New" w:hint="default"/>
+      </w:rPr>
+    </w:lvl>
+    <w:lvl w:ilvl="5" w:tplc="10090005" w:tentative="1">
+      <w:start w:val="1"/>
+      <w:numFmt w:val="bullet"/>
+      <w:lvlText w:val=""/>
+      <w:lvlJc w:val="left"/>
+      <w:pPr>
+        <w:ind w:left="4320" w:hanging="360"/>
+      </w:pPr>
+      <w:rPr>
+        <w:rFonts w:ascii="Wingdings" w:hAnsi="Wingdings" w:hint="default"/>
+      </w:rPr>
+    </w:lvl>
+    <w:lvl w:ilvl="6" w:tplc="10090001" w:tentative="1">
+      <w:start w:val="1"/>
+      <w:numFmt w:val="bullet"/>
+      <w:lvlText w:val=""/>
+      <w:lvlJc w:val="left"/>
+      <w:pPr>
+        <w:ind w:left="5040" w:hanging="360"/>
+      </w:pPr>
+      <w:rPr>
+        <w:rFonts w:ascii="Symbol" w:hAnsi="Symbol" w:hint="default"/>
+      </w:rPr>
+    </w:lvl>
+    <w:lvl w:ilvl="7" w:tplc="10090003" w:tentative="1">
+      <w:start w:val="1"/>
+      <w:numFmt w:val="bullet"/>
+      <w:lvlText w:val="o"/>
+      <w:lvlJc w:val="left"/>
+      <w:pPr>
+        <w:ind w:left="5760" w:hanging="360"/>
+      </w:pPr>
+      <w:rPr>
+        <w:rFonts w:ascii="Courier New" w:hAnsi="Courier New" w:cs="Courier New" w:hint="default"/>
+      </w:rPr>
+    </w:lvl>
+    <w:lvl w:ilvl="8" w:tplc="10090005" w:tentative="1">
+      <w:start w:val="1"/>
+      <w:numFmt w:val="bullet"/>
+      <w:lvlText w:val=""/>
+      <w:lvlJc w:val="left"/>
+      <w:pPr>
+        <w:ind w:left="6480" w:hanging="360"/>
+      </w:pPr>
+      <w:rPr>
+        <w:rFonts w:ascii="Wingdings" w:hAnsi="Wingdings" w:hint="default"/>
+      </w:rPr>
+    </w:lvl>
+  </w:abstractNum>
+  <w:abstractNum w:abstractNumId="1" w15:restartNumberingAfterBreak="0">
     <w:nsid w:val="08210B12"/>
     <w:multiLevelType w:val="multilevel"/>
     <w:tmpl w:val="E18A1DA0"/>
@@ -2532,7 +2833,7 @@
       </w:pPr>
     </w:lvl>
   </w:abstractNum>
-  <w:abstractNum w:abstractNumId="1" w15:restartNumberingAfterBreak="0">
+  <w:abstractNum w:abstractNumId="2" w15:restartNumberingAfterBreak="0">
     <w:nsid w:val="0F8A5049"/>
     <w:multiLevelType w:val="hybridMultilevel"/>
     <w:tmpl w:val="C56A2E3A"/>
@@ -2645,7 +2946,7 @@
       </w:rPr>
     </w:lvl>
   </w:abstractNum>
-  <w:abstractNum w:abstractNumId="2" w15:restartNumberingAfterBreak="0">
+  <w:abstractNum w:abstractNumId="3" w15:restartNumberingAfterBreak="0">
     <w:nsid w:val="27EC2C3C"/>
     <w:multiLevelType w:val="hybridMultilevel"/>
     <w:tmpl w:val="BE7C3DB4"/>
@@ -2731,7 +3032,7 @@
       </w:pPr>
     </w:lvl>
   </w:abstractNum>
-  <w:abstractNum w:abstractNumId="3" w15:restartNumberingAfterBreak="0">
+  <w:abstractNum w:abstractNumId="4" w15:restartNumberingAfterBreak="0">
     <w:nsid w:val="3AC0216C"/>
     <w:multiLevelType w:val="hybridMultilevel"/>
     <w:tmpl w:val="ED3CB746"/>
@@ -2820,7 +3121,7 @@
       </w:pPr>
     </w:lvl>
   </w:abstractNum>
-  <w:abstractNum w:abstractNumId="4" w15:restartNumberingAfterBreak="0">
+  <w:abstractNum w:abstractNumId="5" w15:restartNumberingAfterBreak="0">
     <w:nsid w:val="4E98549E"/>
     <w:multiLevelType w:val="multilevel"/>
     <w:tmpl w:val="DAB6F7CE"/>
@@ -2933,7 +3234,7 @@
       </w:pPr>
     </w:lvl>
   </w:abstractNum>
-  <w:abstractNum w:abstractNumId="5" w15:restartNumberingAfterBreak="0">
+  <w:abstractNum w:abstractNumId="6" w15:restartNumberingAfterBreak="0">
     <w:nsid w:val="52D661DF"/>
     <w:multiLevelType w:val="hybridMultilevel"/>
     <w:tmpl w:val="E7ECE22E"/>
@@ -3019,7 +3320,7 @@
       </w:pPr>
     </w:lvl>
   </w:abstractNum>
-  <w:abstractNum w:abstractNumId="6" w15:restartNumberingAfterBreak="0">
+  <w:abstractNum w:abstractNumId="7" w15:restartNumberingAfterBreak="0">
     <w:nsid w:val="5BDB92AF"/>
     <w:multiLevelType w:val="hybridMultilevel"/>
     <w:tmpl w:val="EE8AB3D2"/>
@@ -3105,7 +3406,7 @@
       </w:pPr>
     </w:lvl>
   </w:abstractNum>
-  <w:abstractNum w:abstractNumId="7" w15:restartNumberingAfterBreak="0">
+  <w:abstractNum w:abstractNumId="8" w15:restartNumberingAfterBreak="0">
     <w:nsid w:val="6F45BCD3"/>
     <w:multiLevelType w:val="hybridMultilevel"/>
     <w:tmpl w:val="776E3E62"/>
@@ -3218,7 +3519,7 @@
       </w:rPr>
     </w:lvl>
   </w:abstractNum>
-  <w:abstractNum w:abstractNumId="8" w15:restartNumberingAfterBreak="0">
+  <w:abstractNum w:abstractNumId="9" w15:restartNumberingAfterBreak="0">
     <w:nsid w:val="7B93CBE7"/>
     <w:multiLevelType w:val="hybridMultilevel"/>
     <w:tmpl w:val="4830EF92"/>
@@ -3305,31 +3606,34 @@
     </w:lvl>
   </w:abstractNum>
   <w:num w:numId="1" w16cid:durableId="2022734882">
+    <w:abstractNumId w:val="3"/>
+  </w:num>
+  <w:num w:numId="2" w16cid:durableId="1514683924">
+    <w:abstractNumId w:val="6"/>
+  </w:num>
+  <w:num w:numId="3" w16cid:durableId="679353345">
+    <w:abstractNumId w:val="8"/>
+  </w:num>
+  <w:num w:numId="4" w16cid:durableId="1889028252">
+    <w:abstractNumId w:val="1"/>
+  </w:num>
+  <w:num w:numId="5" w16cid:durableId="673414316">
+    <w:abstractNumId w:val="5"/>
+  </w:num>
+  <w:num w:numId="6" w16cid:durableId="1585065379">
+    <w:abstractNumId w:val="4"/>
+  </w:num>
+  <w:num w:numId="7" w16cid:durableId="1402098199">
+    <w:abstractNumId w:val="9"/>
+  </w:num>
+  <w:num w:numId="8" w16cid:durableId="560024782">
+    <w:abstractNumId w:val="7"/>
+  </w:num>
+  <w:num w:numId="9" w16cid:durableId="1612392816">
     <w:abstractNumId w:val="2"/>
   </w:num>
-  <w:num w:numId="2" w16cid:durableId="1514683924">
-    <w:abstractNumId w:val="5"/>
-  </w:num>
-  <w:num w:numId="3" w16cid:durableId="679353345">
-    <w:abstractNumId w:val="7"/>
-  </w:num>
-  <w:num w:numId="4" w16cid:durableId="1889028252">
+  <w:num w:numId="10" w16cid:durableId="203179076">
     <w:abstractNumId w:val="0"/>
-  </w:num>
-  <w:num w:numId="5" w16cid:durableId="673414316">
-    <w:abstractNumId w:val="4"/>
-  </w:num>
-  <w:num w:numId="6" w16cid:durableId="1585065379">
-    <w:abstractNumId w:val="3"/>
-  </w:num>
-  <w:num w:numId="7" w16cid:durableId="1402098199">
-    <w:abstractNumId w:val="8"/>
-  </w:num>
-  <w:num w:numId="8" w16cid:durableId="560024782">
-    <w:abstractNumId w:val="6"/>
-  </w:num>
-  <w:num w:numId="9" w16cid:durableId="1612392816">
-    <w:abstractNumId w:val="1"/>
   </w:num>
 </w:numbering>
 </file>
@@ -3920,7 +4224,6 @@
   <w:style w:type="character" w:default="1" w:styleId="DefaultParagraphFont">
     <w:name w:val="Default Paragraph Font"/>
     <w:uiPriority w:val="1"/>
-    <w:semiHidden/>
     <w:unhideWhenUsed/>
   </w:style>
   <w:style w:type="table" w:default="1" w:styleId="TableNormal">
@@ -4782,6 +5085,21 @@
 </file>
 
 <file path=customXml/item1.xml><?xml version="1.0" encoding="utf-8"?>
+<b:Sources xmlns:b="http://schemas.openxmlformats.org/officeDocument/2006/bibliography" xmlns="http://schemas.openxmlformats.org/officeDocument/2006/bibliography" SelectedStyle="\APASixthEditionOfficeOnline.xsl" StyleName="APA" Version="6"/>
+</file>
+
+<file path=customXml/item2.xml><?xml version="1.0" encoding="utf-8"?>
+<p:properties xmlns:p="http://schemas.microsoft.com/office/2006/metadata/properties" xmlns:xsi="http://www.w3.org/2001/XMLSchema-instance" xmlns:pc="http://schemas.microsoft.com/office/infopath/2007/PartnerControls">
+  <documentManagement>
+    <TaxCatchAll xmlns="006c7cb9-3c36-40e5-a5d9-86e0029a058a" xsi:nil="true"/>
+    <lcf76f155ced4ddcb4097134ff3c332f xmlns="a5db53bf-fe91-4cb9-a657-3e0c4c7ee7a0">
+      <Terms xmlns="http://schemas.microsoft.com/office/infopath/2007/PartnerControls"/>
+    </lcf76f155ced4ddcb4097134ff3c332f>
+  </documentManagement>
+</p:properties>
+</file>
+
+<file path=customXml/item3.xml><?xml version="1.0" encoding="utf-8"?>
 <ct:contentTypeSchema xmlns:ct="http://schemas.microsoft.com/office/2006/metadata/contentType" xmlns:ma="http://schemas.microsoft.com/office/2006/metadata/properties/metaAttributes" ct:_="" ma:_="" ma:contentTypeName="Document" ma:contentTypeID="0x01010069BC17E552CE50459814B45CAB38E643" ma:contentTypeVersion="16" ma:contentTypeDescription="Create a new document." ma:contentTypeScope="" ma:versionID="a2c4a0a3be967a154ef3fcd83466f29a">
   <xsd:schema xmlns:xsd="http://www.w3.org/2001/XMLSchema" xmlns:xs="http://www.w3.org/2001/XMLSchema" xmlns:p="http://schemas.microsoft.com/office/2006/metadata/properties" xmlns:ns2="006c7cb9-3c36-40e5-a5d9-86e0029a058a" xmlns:ns3="a5db53bf-fe91-4cb9-a657-3e0c4c7ee7a0" targetNamespace="http://schemas.microsoft.com/office/2006/metadata/properties" ma:root="true" ma:fieldsID="4cb9171e460dc7c1a5cf1b2c367a13c3" ns2:_="" ns3:_="">
     <xsd:import namespace="006c7cb9-3c36-40e5-a5d9-86e0029a058a"/>
@@ -5022,21 +5340,6 @@
 </ct:contentTypeSchema>
 </file>
 
-<file path=customXml/item2.xml><?xml version="1.0" encoding="utf-8"?>
-<p:properties xmlns:p="http://schemas.microsoft.com/office/2006/metadata/properties" xmlns:xsi="http://www.w3.org/2001/XMLSchema-instance" xmlns:pc="http://schemas.microsoft.com/office/infopath/2007/PartnerControls">
-  <documentManagement>
-    <TaxCatchAll xmlns="006c7cb9-3c36-40e5-a5d9-86e0029a058a" xsi:nil="true"/>
-    <lcf76f155ced4ddcb4097134ff3c332f xmlns="a5db53bf-fe91-4cb9-a657-3e0c4c7ee7a0">
-      <Terms xmlns="http://schemas.microsoft.com/office/infopath/2007/PartnerControls"/>
-    </lcf76f155ced4ddcb4097134ff3c332f>
-  </documentManagement>
-</p:properties>
-</file>
-
-<file path=customXml/item3.xml><?xml version="1.0" encoding="utf-8"?>
-<b:Sources xmlns:b="http://schemas.openxmlformats.org/officeDocument/2006/bibliography" xmlns="http://schemas.openxmlformats.org/officeDocument/2006/bibliography" SelectedStyle="\APASixthEditionOfficeOnline.xsl" StyleName="APA" Version="6"/>
-</file>
-
 <file path=customXml/item4.xml><?xml version="1.0" encoding="utf-8"?>
 <?mso-contentType ?>
 <FormTemplates xmlns="http://schemas.microsoft.com/sharepoint/v3/contenttype/forms">
@@ -5047,6 +5350,25 @@
 </file>
 
 <file path=customXml/itemProps1.xml><?xml version="1.0" encoding="utf-8"?>
+<ds:datastoreItem xmlns:ds="http://schemas.openxmlformats.org/officeDocument/2006/customXml" ds:itemID="{9CCE6F10-29EA-4435-9D14-CA35323B46F7}">
+  <ds:schemaRefs>
+    <ds:schemaRef ds:uri="http://schemas.openxmlformats.org/officeDocument/2006/bibliography"/>
+  </ds:schemaRefs>
+</ds:datastoreItem>
+</file>
+
+<file path=customXml/itemProps2.xml><?xml version="1.0" encoding="utf-8"?>
+<ds:datastoreItem xmlns:ds="http://schemas.openxmlformats.org/officeDocument/2006/customXml" ds:itemID="{7DD5FB73-754E-4AAE-A48C-6A2800E5824A}">
+  <ds:schemaRefs>
+    <ds:schemaRef ds:uri="http://schemas.microsoft.com/office/2006/metadata/properties"/>
+    <ds:schemaRef ds:uri="http://schemas.microsoft.com/office/infopath/2007/PartnerControls"/>
+    <ds:schemaRef ds:uri="006c7cb9-3c36-40e5-a5d9-86e0029a058a"/>
+    <ds:schemaRef ds:uri="a5db53bf-fe91-4cb9-a657-3e0c4c7ee7a0"/>
+  </ds:schemaRefs>
+</ds:datastoreItem>
+</file>
+
+<file path=customXml/itemProps3.xml><?xml version="1.0" encoding="utf-8"?>
 <ds:datastoreItem xmlns:ds="http://schemas.openxmlformats.org/officeDocument/2006/customXml" ds:itemID="{5970E60F-A0EA-49BD-8C9A-E2BCF4F7F847}">
   <ds:schemaRefs>
     <ds:schemaRef ds:uri="http://schemas.microsoft.com/office/2006/metadata/contentType"/>
@@ -5065,25 +5387,6 @@
 </ds:datastoreItem>
 </file>
 
-<file path=customXml/itemProps2.xml><?xml version="1.0" encoding="utf-8"?>
-<ds:datastoreItem xmlns:ds="http://schemas.openxmlformats.org/officeDocument/2006/customXml" ds:itemID="{7DD5FB73-754E-4AAE-A48C-6A2800E5824A}">
-  <ds:schemaRefs>
-    <ds:schemaRef ds:uri="http://schemas.microsoft.com/office/2006/metadata/properties"/>
-    <ds:schemaRef ds:uri="http://schemas.microsoft.com/office/infopath/2007/PartnerControls"/>
-    <ds:schemaRef ds:uri="006c7cb9-3c36-40e5-a5d9-86e0029a058a"/>
-    <ds:schemaRef ds:uri="a5db53bf-fe91-4cb9-a657-3e0c4c7ee7a0"/>
-  </ds:schemaRefs>
-</ds:datastoreItem>
-</file>
-
-<file path=customXml/itemProps3.xml><?xml version="1.0" encoding="utf-8"?>
-<ds:datastoreItem xmlns:ds="http://schemas.openxmlformats.org/officeDocument/2006/customXml" ds:itemID="{9CCE6F10-29EA-4435-9D14-CA35323B46F7}">
-  <ds:schemaRefs>
-    <ds:schemaRef ds:uri="http://schemas.openxmlformats.org/officeDocument/2006/bibliography"/>
-  </ds:schemaRefs>
-</ds:datastoreItem>
-</file>
-
 <file path=customXml/itemProps4.xml><?xml version="1.0" encoding="utf-8"?>
 <ds:datastoreItem xmlns:ds="http://schemas.openxmlformats.org/officeDocument/2006/customXml" ds:itemID="{FD6C645E-6030-432D-A549-19FFA0DD07DF}">
   <ds:schemaRefs>

</xml_diff>